<commit_message>
Actualizar informe de avance y presentación con la publicación en iOS
</commit_message>
<xml_diff>
--- a/Fase 2/Evidencias Grupales/2.4_GuiaEstudiante_Fase 2_DesarrolloProyecto APT (Español).docx
+++ b/Fase 2/Evidencias Grupales/2.4_GuiaEstudiante_Fase 2_DesarrolloProyecto APT (Español).docx
@@ -602,7 +602,7 @@
           <w:szCs w:val="22"/>
         </w:rPr>
         <w:tab/>
-        <w:t>10</w:t>
+        <w:t>11</w:t>
       </w:r>
     </w:p>
     <w:p>
@@ -655,7 +655,7 @@
           <w:sz w:val="22"/>
           <w:szCs w:val="22"/>
         </w:rPr>
-        <w:t xml:space="preserve">Este informe presenta el avance al 28 de octubre de 2026: el prototipo funcional, el repositorio público en GitHub con el código y la documentación, el backlog organizado en sprints y el manejo seguro de las credenciales. También describe los ajustes hechos a partir de la retroalimentación de la Fase 1, el estado de cada actividad del plan de trabajo y las acciones para las etapas que siguen: seguridad, despliegue en la nube, privacidad y publicación en Google Play.</w:t>
+        <w:t xml:space="preserve">Este informe presenta el avance al 28 de octubre de 2026: el prototipo funcional, el repositorio público en GitHub con el código y la documentación, el backlog organizado en sprints y el manejo seguro de las credenciales. También describe los ajustes hechos a partir de la retroalimentación de la Fase 1, entre ellos la publicación también en App Store para iPhone, el estado de cada actividad del plan de trabajo y las acciones para las etapas que siguen: seguridad, despliegue en la nube, privacidad y publicación en Google Play y App Store.</w:t>
       </w:r>
     </w:p>
     <w:p>
@@ -729,7 +729,7 @@
           <w:sz w:val="22"/>
           <w:szCs w:val="22"/>
         </w:rPr>
-        <w:t xml:space="preserve">This report presents the progress up to 28 October 2026: a working prototype, a public GitHub repository with the code and documentation, a backlog organised into sprints, and the secure handling of credentials. It also describes the adjustments made after the Phase 1 feedback, the status of each activity in the work plan, and the next stages: security, cloud deployment, privacy and release on Google Play.</w:t>
+        <w:t xml:space="preserve">This report presents the progress up to 28 October 2026: a working prototype, a public GitHub repository with the code and documentation, a backlog organised into sprints, and the secure handling of credentials. It also describes the adjustments made after the Phase 1 feedback, including a release on the App Store for iPhone users, the status of each activity in the work plan, and the next stages: security, cloud deployment, privacy and release on Google Play and the App Store.</w:t>
       </w:r>
     </w:p>
     <w:p>
@@ -1671,7 +1671,7 @@
                 <w:sz w:val="20"/>
                 <w:szCs w:val="20"/>
               </w:rPr>
-              <w:t xml:space="preserve">•	OE6, desplegar en la nube y publicar en Google Play: no iniciado, planificado para el Sprint 2 y el cierre.</w:t>
+              <w:t xml:space="preserve">•	OE6 (ajustado), desplegar en la nube y publicar en Google Play y App Store: no iniciado, planificado para el Sprint 2 y el cierre.</w:t>
             </w:r>
           </w:p>
         </w:tc>
@@ -1708,6 +1708,32 @@
           </w:tcPr>
           <w:p>
             <w:pPr>
+              <w:spacing w:before="0" w:after="80" w:line="252" w:lineRule="auto"/>
+              <w:jc w:val="both"/>
+            </w:pPr>
+            <w:r>
+              <w:rPr>
+                <w:rFonts w:ascii="Calibri" w:hAnsi="Calibri" w:cs="Calibri" w:eastAsia="Calibri"/>
+                <w:color w:val="000000"/>
+                <w:sz w:val="20"/>
+                <w:szCs w:val="20"/>
+              </w:rPr>
+              <w:t xml:space="preserve">Se mantiene el objetivo general. Se ajusta el objetivo específico 6, que ahora es: </w:t>
+            </w:r>
+            <w:r>
+              <w:rPr>
+                <w:rFonts w:ascii="Calibri" w:hAnsi="Calibri" w:cs="Calibri" w:eastAsia="Calibri"/>
+                <w:b/>
+                <w:bCs/>
+                <w:color w:val="000000"/>
+                <w:sz w:val="20"/>
+                <w:szCs w:val="20"/>
+              </w:rPr>
+              <w:t xml:space="preserve">desplegar la API y la base de datos en la nube y publicar la aplicación en Google Play y en App Store, partiendo por una prueba cerrada y TestFlight.</w:t>
+            </w:r>
+          </w:p>
+          <w:p>
+            <w:pPr>
               <w:spacing w:before="0" w:after="0" w:line="252" w:lineRule="auto"/>
               <w:jc w:val="both"/>
             </w:pPr>
@@ -1718,7 +1744,7 @@
                 <w:sz w:val="20"/>
                 <w:szCs w:val="20"/>
               </w:rPr>
-              <w:t xml:space="preserve">Sin ajustes. Se mantienen el objetivo general y los seis objetivos específicos definidos en la Fase 1, porque siguen siendo alcanzables dentro del semestre con el avance logrado.</w:t>
+              <w:t xml:space="preserve">El ajuste responde a la retroalimentación de la Fase 1: en Irlanda el 47 % de los teléfonos usa iOS (StatCounter, 2026), así que publicar solo en Android dejaba fuera a casi la mitad de los clientes. Los otros cinco objetivos se mantienen.</w:t>
             </w:r>
           </w:p>
         </w:tc>
@@ -1787,6 +1813,21 @@
           </w:p>
           <w:p>
             <w:pPr>
+              <w:spacing w:before="0" w:after="80" w:line="252" w:lineRule="auto"/>
+              <w:jc w:val="both"/>
+            </w:pPr>
+            <w:r>
+              <w:rPr>
+                <w:rFonts w:ascii="Calibri" w:hAnsi="Calibri" w:cs="Calibri" w:eastAsia="Calibri"/>
+                <w:color w:val="000000"/>
+                <w:sz w:val="20"/>
+                <w:szCs w:val="20"/>
+              </w:rPr>
+              <w:t xml:space="preserve">En la práctica, el backlog está en GitHub: cada sprint es un milestone y cada tarea un issue, con historias de usuario y estimación en puntos (13 por sprint). El avance se controla cerrando issues y cada cambio queda registrado en el historial de commits. Cada sprint termina con una revisión, con demo en un teléfono, y una retrospectiva. Como el proyecto es individual, asumo los roles de Product Owner, Scrum Master y desarrollador.</w:t>
+            </w:r>
+          </w:p>
+          <w:p>
+            <w:pPr>
               <w:spacing w:before="0" w:after="0" w:line="252" w:lineRule="auto"/>
               <w:jc w:val="both"/>
             </w:pPr>
@@ -1797,7 +1838,7 @@
                 <w:sz w:val="20"/>
                 <w:szCs w:val="20"/>
               </w:rPr>
-              <w:t xml:space="preserve">En la práctica, el backlog está en GitHub: cada sprint es un milestone y cada tarea un issue, con historias de usuario y estimación en puntos (13 por sprint). El avance se controla cerrando issues y cada cambio queda registrado en el historial de commits. Cada sprint termina con una revisión, con demo en un teléfono, y una retrospectiva. Como el proyecto es individual, asumo los roles de Product Owner, Scrum Master y desarrollador.</w:t>
+              <w:t xml:space="preserve">Ejemplo: el pedido de publicar también en iOS entró al backlog como tareas nuevas y se rebalanceó el Sprint 2, sin rehacer el plan.</w:t>
             </w:r>
           </w:p>
         </w:tc>
@@ -1918,7 +1959,7 @@
                 <w:sz w:val="20"/>
                 <w:szCs w:val="20"/>
               </w:rPr>
-              <w:t xml:space="preserve">•	Documentación: requisitos funcionales y no funcionales, arquitectura y backlog por sprint en Fase 2/Evidencias de documentación. Muestran el análisis y el diseño del sistema.</w:t>
+              <w:t xml:space="preserve">•	Documentación: matriz de requisitos en Excel (28 requisitos con criterios de aceptación), arquitectura, backlog por sprint y plan de publicación en iOS en Fase 2/Evidencias de documentación. Muestran el análisis y el diseño.</w:t>
             </w:r>
           </w:p>
           <w:p>
@@ -1971,7 +2012,7 @@
                 <w:sz w:val="20"/>
                 <w:szCs w:val="20"/>
               </w:rPr>
-              <w:t xml:space="preserve">Para resguardar la calidad apliqué prácticas propias de la disciplina: configuración por variables de entorno, sin secretos en el repositorio (Wiggins, 2017); contraseñas guardadas con bcrypt y sesiones con JWT; permisos por rol validados en el servidor; validación de datos de entrada con modelos tipados; QR con vencimiento automático en la base de datos; y la lista OWASP Mobile Top 10 como referencia para el Sprint 1 (OWASP Foundation, 2024).</w:t>
+              <w:t xml:space="preserve">Para resguardar la calidad apliqué prácticas de la disciplina: variables de entorno y ningún secreto en el repositorio (Wiggins, 2017); contraseñas con bcrypt y sesiones con JWT; permisos por rol en el servidor; validación de datos con modelos tipados; QR con vencimiento automático; y OWASP Mobile Top 10 como referencia (OWASP Foundation, 2024).</w:t>
             </w:r>
           </w:p>
         </w:tc>
@@ -2943,7 +2984,7 @@
                 <w:sz w:val="15"/>
                 <w:szCs w:val="15"/>
               </w:rPr>
-              <w:t xml:space="preserve">Sprint 2: en la nube (API y base de datos con HTTPS en Europa, login con Google, prueba cerrada)</w:t>
+              <w:t xml:space="preserve">Sprint 2: en la nube, Android e iOS (API y base de datos con HTTPS en Europa, login con Google y con Apple, prueba cerrada y TestFlight)</w:t>
             </w:r>
           </w:p>
         </w:tc>
@@ -2964,7 +3005,7 @@
                 <w:sz w:val="15"/>
                 <w:szCs w:val="15"/>
               </w:rPr>
-              <w:t xml:space="preserve">Render o Railway, MongoDB Atlas, EAS, Google Play Console</w:t>
+              <w:t xml:space="preserve">Render o Railway, MongoDB Atlas, EAS, Google Play Console, Apple Developer Program</w:t>
             </w:r>
           </w:p>
         </w:tc>
@@ -3027,7 +3068,7 @@
                 <w:sz w:val="15"/>
                 <w:szCs w:val="15"/>
               </w:rPr>
-              <w:t xml:space="preserve">La prueba cerrada debe partir a tiempo para cumplir los 14 días.</w:t>
+              <w:t xml:space="preserve">La prueba cerrada y la cuenta de Apple deben partir a tiempo. Facilita que EAS compile iOS sin Mac.</w:t>
             </w:r>
           </w:p>
         </w:tc>
@@ -3069,7 +3110,7 @@
                 <w:sz w:val="15"/>
                 <w:szCs w:val="15"/>
               </w:rPr>
-              <w:t xml:space="preserve">Se agrega la rotación de claves al crear el ambiente de producción.</w:t>
+              <w:t xml:space="preserve">Se agregan las tareas de iOS por la retroalimentación docente y la rotación de claves. Las imágenes en la nube pasan al Sprint 3.</w:t>
             </w:r>
           </w:p>
         </w:tc>
@@ -3240,7 +3281,7 @@
                 <w:sz w:val="15"/>
                 <w:szCs w:val="15"/>
               </w:rPr>
-              <w:t xml:space="preserve">Sin ajustes.</w:t>
+              <w:t xml:space="preserve">Se suman la ficha de App Store (privacidad y permisos) y la tarea de imágenes en la nube.</w:t>
             </w:r>
           </w:p>
         </w:tc>
@@ -3582,7 +3623,7 @@
                 <w:sz w:val="15"/>
                 <w:szCs w:val="15"/>
               </w:rPr>
-              <w:t xml:space="preserve">Sin ajustes.</w:t>
+              <w:t xml:space="preserve">Se prueba también en iPhones, con TestFlight.</w:t>
             </w:r>
           </w:p>
         </w:tc>
@@ -3753,7 +3794,7 @@
                 <w:sz w:val="15"/>
                 <w:szCs w:val="15"/>
               </w:rPr>
-              <w:t xml:space="preserve">Las fechas se alinean con el calendario de presentaciones de la asignatura.</w:t>
+              <w:t xml:space="preserve">Se suma el envío a revisión de Apple. Las fechas se alinean con el calendario de la asignatura.</w:t>
             </w:r>
           </w:p>
         </w:tc>
@@ -4081,23 +4122,6 @@
           </w:p>
           <w:p>
             <w:pPr>
-              <w:spacing w:before="0" w:after="80" w:line="252" w:lineRule="auto"/>
-              <w:jc w:val="both"/>
-            </w:pPr>
-            <w:r>
-              <w:rPr>
-                <w:rFonts w:ascii="Calibri" w:hAnsi="Calibri" w:cs="Calibri" w:eastAsia="Calibri"/>
-                <w:b/>
-                <w:bCs/>
-                <w:color w:val="000000"/>
-                <w:sz w:val="20"/>
-                <w:szCs w:val="20"/>
-              </w:rPr>
-              <w:t xml:space="preserve">Dificultades y acciones</w:t>
-            </w:r>
-          </w:p>
-          <w:p>
-            <w:pPr>
               <w:tabs>
                 <w:tab w:val="left" w:pos="300"/>
               </w:tabs>
@@ -4112,7 +4136,24 @@
                 <w:sz w:val="20"/>
                 <w:szCs w:val="20"/>
               </w:rPr>
-              <w:t xml:space="preserve">•	Comencé la Fase 1 más tarde que el curso, con autorización del docente. Acción: adelanté el Sprint 0 a la misma semana de la entrega de la Fase 1 para recuperar tiempo.</w:t>
+              <w:t xml:space="preserve">•	Como la app está hecha con Expo, la versión de iOS se compila en la nube con EAS Build, sin necesidad de un Mac.</w:t>
+            </w:r>
+          </w:p>
+          <w:p>
+            <w:pPr>
+              <w:spacing w:before="0" w:after="80" w:line="252" w:lineRule="auto"/>
+              <w:jc w:val="both"/>
+            </w:pPr>
+            <w:r>
+              <w:rPr>
+                <w:rFonts w:ascii="Calibri" w:hAnsi="Calibri" w:cs="Calibri" w:eastAsia="Calibri"/>
+                <w:b/>
+                <w:bCs/>
+                <w:color w:val="000000"/>
+                <w:sz w:val="20"/>
+                <w:szCs w:val="20"/>
+              </w:rPr>
+              <w:t xml:space="preserve">Dificultades y acciones</w:t>
             </w:r>
           </w:p>
           <w:p>
@@ -4131,7 +4172,7 @@
                 <w:sz w:val="20"/>
                 <w:szCs w:val="20"/>
               </w:rPr>
-              <w:t xml:space="preserve">•	Estudio y trabajo en paralelo desde Irlanda, con diferencia horaria con Chile. Acción: divido el trabajo en tareas chicas dentro de GitHub, para avanzar en bloques cortos sin perder el hilo, y dejo todo el avance en el repositorio para que se pueda revisar en cualquier momento.</w:t>
+              <w:t xml:space="preserve">•	Comencé la Fase 1 más tarde que el curso, con autorización del docente. Acción: adelanté el Sprint 0 a la misma semana de la entrega de la Fase 1 para recuperar tiempo.</w:t>
             </w:r>
           </w:p>
           <w:p>
@@ -4150,7 +4191,7 @@
                 <w:sz w:val="20"/>
                 <w:szCs w:val="20"/>
               </w:rPr>
-              <w:t xml:space="preserve">•	Algunas actividades de la asignatura son presenciales en la sede. Acción: coordinar con la docente una conexión online y mostrar el avance con la demo y el repositorio.</w:t>
+              <w:t xml:space="preserve">•	Estudio y trabajo en paralelo desde Irlanda, con diferencia horaria con Chile. Acción: divido el trabajo en tareas chicas dentro de GitHub, para avanzar en bloques cortos sin perder el hilo, y dejo todo el avance en el repositorio para que se pueda revisar en cualquier momento.</w:t>
             </w:r>
           </w:p>
           <w:p>
@@ -4169,7 +4210,45 @@
                 <w:sz w:val="20"/>
                 <w:szCs w:val="20"/>
               </w:rPr>
+              <w:t xml:space="preserve">•	Algunas actividades de la asignatura son presenciales en la sede. Acción: coordinar con la docente una conexión online y mostrar el avance con la demo y el repositorio.</w:t>
+            </w:r>
+          </w:p>
+          <w:p>
+            <w:pPr>
+              <w:tabs>
+                <w:tab w:val="left" w:pos="300"/>
+              </w:tabs>
+              <w:spacing w:before="0" w:after="60" w:line="252" w:lineRule="auto"/>
+              <w:ind w:left="300" w:hanging="300"/>
+              <w:jc w:val="left"/>
+            </w:pPr>
+            <w:r>
+              <w:rPr>
+                <w:rFonts w:ascii="Calibri" w:hAnsi="Calibri" w:cs="Calibri" w:eastAsia="Calibri"/>
+                <w:color w:val="000000"/>
+                <w:sz w:val="20"/>
+                <w:szCs w:val="20"/>
+              </w:rPr>
               <w:t xml:space="preserve">•	Al publicar el repositorio apareció un riesgo de seguridad no previsto para esa semana. Acción: adelanté la eliminación del endpoint expuesto y la limpieza de credenciales antes de subir el código.</w:t>
+            </w:r>
+          </w:p>
+          <w:p>
+            <w:pPr>
+              <w:tabs>
+                <w:tab w:val="left" w:pos="300"/>
+              </w:tabs>
+              <w:spacing w:before="0" w:after="60" w:line="252" w:lineRule="auto"/>
+              <w:ind w:left="300" w:hanging="300"/>
+              <w:jc w:val="left"/>
+            </w:pPr>
+            <w:r>
+              <w:rPr>
+                <w:rFonts w:ascii="Calibri" w:hAnsi="Calibri" w:cs="Calibri" w:eastAsia="Calibri"/>
+                <w:color w:val="000000"/>
+                <w:sz w:val="20"/>
+                <w:szCs w:val="20"/>
+              </w:rPr>
+              <w:t xml:space="preserve">•	No tengo Mac ni iPhone para la versión de iOS. Acción: compilar en la nube con EAS Build, probar con TestFlight en iPhones del personal y de conocidos, y arrendar un Mac por horas solo si aparece un error que lo necesite.</w:t>
             </w:r>
           </w:p>
         </w:tc>
@@ -4464,6 +4543,45 @@
               <w:t xml:space="preserve"> Se reorganizó con las carpetas y los nombres de archivo que exige la asignatura (Fase 1, Fase 2 y Fase 3).</w:t>
             </w:r>
           </w:p>
+          <w:p>
+            <w:pPr>
+              <w:tabs>
+                <w:tab w:val="left" w:pos="300"/>
+              </w:tabs>
+              <w:spacing w:before="0" w:after="60" w:line="252" w:lineRule="auto"/>
+              <w:ind w:left="300" w:hanging="300"/>
+              <w:jc w:val="left"/>
+            </w:pPr>
+            <w:r>
+              <w:rPr>
+                <w:rFonts w:ascii="Calibri" w:hAnsi="Calibri" w:cs="Calibri" w:eastAsia="Calibri"/>
+                <w:color w:val="000000"/>
+                <w:sz w:val="20"/>
+                <w:szCs w:val="20"/>
+              </w:rPr>
+              <w:t xml:space="preserve">•	</w:t>
+            </w:r>
+            <w:r>
+              <w:rPr>
+                <w:rFonts w:ascii="Calibri" w:hAnsi="Calibri" w:cs="Calibri" w:eastAsia="Calibri"/>
+                <w:b/>
+                <w:bCs/>
+                <w:color w:val="000000"/>
+                <w:sz w:val="20"/>
+                <w:szCs w:val="20"/>
+              </w:rPr>
+              <w:t xml:space="preserve">Publicación también en App Store (iOS).</w:t>
+            </w:r>
+            <w:r>
+              <w:rPr>
+                <w:rFonts w:ascii="Calibri" w:hAnsi="Calibri" w:cs="Calibri" w:eastAsia="Calibri"/>
+                <w:color w:val="000000"/>
+                <w:sz w:val="20"/>
+                <w:szCs w:val="20"/>
+              </w:rPr>
+              <w:t xml:space="preserve"> Por la retroalimentación docente: en Irlanda el 47 % de los teléfonos usa iOS (StatCounter, 2026). Se agregan la cuenta de Apple Developer Program (99 USD al año), el inicio de sesión con Apple, que Apple exige si la app ofrece login con Google (Apple, s.f.-b), el build de iOS con EAS y TestFlight, y la ficha de App Store. El costo total para publicar pasa de 35 a 54 USD a 134 a 183 USD. Para no sobrecargar el Sprint 2, la tarea de imágenes en la nube pasa al Sprint 3. El detalle está en Plan_publicacion_iOS.md.</w:t>
+            </w:r>
+          </w:p>
         </w:tc>
       </w:tr>
     </w:tbl>
@@ -4678,6 +4796,21 @@
     </w:p>
     <w:p>
       <w:pPr>
+        <w:spacing w:before="0" w:after="120" w:line="276" w:lineRule="auto"/>
+        <w:jc w:val="both"/>
+      </w:pPr>
+      <w:r>
+        <w:rPr>
+          <w:rFonts w:ascii="Calibri" w:hAnsi="Calibri" w:cs="Calibri" w:eastAsia="Calibri"/>
+          <w:color w:val="000000"/>
+          <w:sz w:val="22"/>
+          <w:szCs w:val="22"/>
+        </w:rPr>
+        <w:t xml:space="preserve">After the Phase 1 feedback, the app will also be released on the App Store, because almost half of the phones in Ireland use iOS. Since the app is built with Expo, the iOS version can be compiled in the cloud, so I do not need a Mac. The main new costs are the Apple developer account and an extra sign-in option with Apple.</w:t>
+      </w:r>
+    </w:p>
+    <w:p>
+      <w:pPr>
         <w:keepNext/>
         <w:spacing w:before="240" w:after="120" w:line="276" w:lineRule="auto"/>
         <w:jc w:val="left"/>
@@ -4755,7 +4888,7 @@
           <w:sz w:val="22"/>
           <w:szCs w:val="22"/>
         </w:rPr>
-        <w:t xml:space="preserve">Google. (s.f.). Requisitos de prueba de apps para cuentas de desarrollador personales nuevas. Ayuda de Play Console. https://support.google.com/googleplay/android-developer/answer/14151465</w:t>
+        <w:t xml:space="preserve">Apple. (s.f.-a). Apple Developer Program: enrollment. https://developer.apple.com/programs/enroll/</w:t>
       </w:r>
     </w:p>
     <w:p>
@@ -4771,7 +4904,7 @@
           <w:sz w:val="22"/>
           <w:szCs w:val="22"/>
         </w:rPr>
-        <w:t xml:space="preserve">OWASP Foundation. (2024). OWASP Mobile Top 10. https://owasp.org/www-project-mobile-top-10/</w:t>
+        <w:t xml:space="preserve">Apple. (s.f.-b). App Store Review Guidelines. https://developer.apple.com/app-store/review/guidelines/</w:t>
       </w:r>
     </w:p>
     <w:p>
@@ -4787,7 +4920,7 @@
           <w:sz w:val="22"/>
           <w:szCs w:val="22"/>
         </w:rPr>
-        <w:t xml:space="preserve">Parlamento Europeo y Consejo de la Unión Europea. (2016). Reglamento (UE) 2016/679, Reglamento General de Protección de Datos. Diario Oficial de la Unión Europea, L 119.</w:t>
+        <w:t xml:space="preserve">Expo. (s.f.). Pricing. https://expo.dev/pricing</w:t>
       </w:r>
     </w:p>
     <w:p>
@@ -4803,7 +4936,7 @@
           <w:sz w:val="22"/>
           <w:szCs w:val="22"/>
         </w:rPr>
-        <w:t xml:space="preserve">Project Management Institute. (2017). Guía de los fundamentos para la dirección de proyectos (Guía del PMBOK) (6.ª ed.). Project Management Institute.</w:t>
+        <w:t xml:space="preserve">Google. (s.f.). Requisitos de prueba de apps para cuentas de desarrollador personales nuevas. Ayuda de Play Console. https://support.google.com/googleplay/android-developer/answer/14151465</w:t>
       </w:r>
     </w:p>
     <w:p>
@@ -4819,7 +4952,7 @@
           <w:sz w:val="22"/>
           <w:szCs w:val="22"/>
         </w:rPr>
-        <w:t xml:space="preserve">Schwaber, K. y Sutherland, J. (2020). La Guía Scrum. https://scrumguides.org</w:t>
+        <w:t xml:space="preserve">OWASP Foundation. (2024). OWASP Mobile Top 10. https://owasp.org/www-project-mobile-top-10/</w:t>
       </w:r>
     </w:p>
     <w:p>
@@ -4835,7 +4968,71 @@
           <w:sz w:val="22"/>
           <w:szCs w:val="22"/>
         </w:rPr>
+        <w:t xml:space="preserve">Parlamento Europeo y Consejo de la Unión Europea. (2016). Reglamento (UE) 2016/679, Reglamento General de Protección de Datos. Diario Oficial de la Unión Europea, L 119.</w:t>
+      </w:r>
+    </w:p>
+    <w:p>
+      <w:pPr>
+        <w:spacing w:before="0" w:after="120" w:line="276" w:lineRule="auto"/>
+        <w:ind w:left="720" w:hanging="720"/>
+        <w:jc w:val="left"/>
+      </w:pPr>
+      <w:r>
+        <w:rPr>
+          <w:rFonts w:ascii="Calibri" w:hAnsi="Calibri" w:cs="Calibri" w:eastAsia="Calibri"/>
+          <w:color w:val="000000"/>
+          <w:sz w:val="22"/>
+          <w:szCs w:val="22"/>
+        </w:rPr>
+        <w:t xml:space="preserve">Project Management Institute. (2017). Guía de los fundamentos para la dirección de proyectos (Guía del PMBOK) (6.ª ed.). Project Management Institute.</w:t>
+      </w:r>
+    </w:p>
+    <w:p>
+      <w:pPr>
+        <w:spacing w:before="0" w:after="120" w:line="276" w:lineRule="auto"/>
+        <w:ind w:left="720" w:hanging="720"/>
+        <w:jc w:val="left"/>
+      </w:pPr>
+      <w:r>
+        <w:rPr>
+          <w:rFonts w:ascii="Calibri" w:hAnsi="Calibri" w:cs="Calibri" w:eastAsia="Calibri"/>
+          <w:color w:val="000000"/>
+          <w:sz w:val="22"/>
+          <w:szCs w:val="22"/>
+        </w:rPr>
+        <w:t xml:space="preserve">Schwaber, K. y Sutherland, J. (2020). La Guía Scrum. https://scrumguides.org</w:t>
+      </w:r>
+    </w:p>
+    <w:p>
+      <w:pPr>
+        <w:spacing w:before="0" w:after="120" w:line="276" w:lineRule="auto"/>
+        <w:ind w:left="720" w:hanging="720"/>
+        <w:jc w:val="left"/>
+      </w:pPr>
+      <w:r>
+        <w:rPr>
+          <w:rFonts w:ascii="Calibri" w:hAnsi="Calibri" w:cs="Calibri" w:eastAsia="Calibri"/>
+          <w:color w:val="000000"/>
+          <w:sz w:val="22"/>
+          <w:szCs w:val="22"/>
+        </w:rPr>
         <w:t xml:space="preserve">Sommerville, I. (2011). Ingeniería de software (9.ª ed.). Pearson.</w:t>
+      </w:r>
+    </w:p>
+    <w:p>
+      <w:pPr>
+        <w:spacing w:before="0" w:after="120" w:line="276" w:lineRule="auto"/>
+        <w:ind w:left="720" w:hanging="720"/>
+        <w:jc w:val="left"/>
+      </w:pPr>
+      <w:r>
+        <w:rPr>
+          <w:rFonts w:ascii="Calibri" w:hAnsi="Calibri" w:cs="Calibri" w:eastAsia="Calibri"/>
+          <w:color w:val="000000"/>
+          <w:sz w:val="22"/>
+          <w:szCs w:val="22"/>
+        </w:rPr>
+        <w:t xml:space="preserve">StatCounter. (2026). Mobile operating system market share Ireland. https://gs.statcounter.com/os-market-share/mobile/ireland</w:t>
       </w:r>
     </w:p>
     <w:p>

</xml_diff>

<commit_message>
Reflejar la inscripción en Apple adelantada al Sprint 1
</commit_message>
<xml_diff>
--- a/Fase 2/Evidencias Grupales/2.4_GuiaEstudiante_Fase 2_DesarrolloProyecto APT (Español).docx
+++ b/Fase 2/Evidencias Grupales/2.4_GuiaEstudiante_Fase 2_DesarrolloProyecto APT (Español).docx
@@ -2939,7 +2939,7 @@
                 <w:sz w:val="15"/>
                 <w:szCs w:val="15"/>
               </w:rPr>
-              <w:t xml:space="preserve">Una tarea menos: el endpoint expuesto ya se resolvió en el Sprint 0.</w:t>
+              <w:t xml:space="preserve">El endpoint expuesto ya se resolvió en el Sprint 0. Se suma la inscripción en Apple, que bloquea el build de iOS.</w:t>
             </w:r>
           </w:p>
         </w:tc>
@@ -4579,7 +4579,7 @@
                 <w:sz w:val="20"/>
                 <w:szCs w:val="20"/>
               </w:rPr>
-              <w:t xml:space="preserve"> Por la retroalimentación docente: en Irlanda el 47 % de los teléfonos usa iOS (StatCounter, 2026). Se agregan la cuenta de Apple Developer Program (99 USD al año), el inicio de sesión con Apple, que Apple exige si la app ofrece login con Google (Apple, s.f.-b), el build de iOS con EAS y TestFlight, y la ficha de App Store. El costo total para publicar pasa de 35 a 54 USD a 134 a 183 USD. Para no sobrecargar el Sprint 2, la tarea de imágenes en la nube pasa al Sprint 3. El detalle está en Plan_publicacion_iOS.md.</w:t>
+              <w:t xml:space="preserve"> Por la retroalimentación docente: en Irlanda el 47 % de los teléfonos usa iOS (StatCounter, 2026). Se agregan la cuenta de Apple Developer Program (99 USD al año), el inicio de sesión con Apple, que Apple exige si la app ofrece login con Google (Apple, s.f.-b), el build de iOS con EAS y TestFlight, y la ficha de App Store. El costo total para publicar pasa de 35 a 54 USD a 134 a 183 USD. Para no sobrecargar el Sprint 2, la tarea de imágenes en la nube pasa al Sprint 3, y la inscripción en Apple se adelanta al Sprint 1 porque su verificación puede tardar y bloquea el build de iOS. El detalle está en Plan_publicacion_iOS.md.</w:t>
             </w:r>
           </w:p>
         </w:tc>

</xml_diff>

<commit_message>
Actualizar el avance del Sprint 1: CORS, límite de intentos y primeras pruebas
- Matriz de requisitos: RNF-05 implementado y RNF-11 parcial, con su evidencia.
- Informe de avance: fecha de corte 29 de octubre, estado del Sprint 1 y de las pruebas.
- Presentación: RNF-05 listo y línea de avance del Sprint 1.
- Arquitectura y README: seguridad aplicada y cómo correr las pruebas.
</commit_message>
<xml_diff>
--- a/Fase 2/Evidencias Grupales/2.4_GuiaEstudiante_Fase 2_DesarrolloProyecto APT (Español).docx
+++ b/Fase 2/Evidencias Grupales/2.4_GuiaEstudiante_Fase 2_DesarrolloProyecto APT (Español).docx
@@ -225,7 +225,7 @@
           <w:sz w:val="22"/>
           <w:szCs w:val="22"/>
         </w:rPr>
-        <w:t xml:space="preserve"> 28 de octubre de 2026</w:t>
+        <w:t xml:space="preserve"> 29 de octubre de 2026</w:t>
       </w:r>
     </w:p>
     <w:p>
@@ -655,7 +655,7 @@
           <w:sz w:val="22"/>
           <w:szCs w:val="22"/>
         </w:rPr>
-        <w:t xml:space="preserve">Este informe presenta el avance al 28 de octubre de 2026: el prototipo funcional, el repositorio público en GitHub con el código y la documentación, el backlog organizado en sprints y el manejo seguro de las credenciales. También describe los ajustes hechos a partir de la retroalimentación de la Fase 1, entre ellos la publicación también en App Store para iPhone, el estado de cada actividad del plan de trabajo y las acciones para las etapas que siguen: seguridad, despliegue en la nube, privacidad y publicación en Google Play y App Store.</w:t>
+        <w:t xml:space="preserve">Este informe presenta el avance al 29 de octubre de 2026: el prototipo funcional, el repositorio público en GitHub con el código y la documentación, el backlog organizado en sprints y el manejo seguro de las credenciales. También describe los ajustes hechos a partir de la retroalimentación de la Fase 1, entre ellos la publicación también en App Store para iPhone, el estado de cada actividad del plan de trabajo y las acciones para las etapas que siguen: seguridad, despliegue en la nube, privacidad y publicación en Google Play y App Store.</w:t>
       </w:r>
     </w:p>
     <w:p>
@@ -729,7 +729,7 @@
           <w:sz w:val="22"/>
           <w:szCs w:val="22"/>
         </w:rPr>
-        <w:t xml:space="preserve">This report presents the progress up to 28 October 2026: a working prototype, a public GitHub repository with the code and documentation, a backlog organised into sprints, and the secure handling of credentials. It also describes the adjustments made after the Phase 1 feedback, including a release on the App Store for iPhone users, the status of each activity in the work plan, and the next stages: security, cloud deployment, privacy and release on Google Play and the App Store.</w:t>
+        <w:t xml:space="preserve">This report presents the progress up to 29 October 2026: a working prototype, a public GitHub repository with the code and documentation, a backlog organised into sprints, and the secure handling of credentials. It also describes the adjustments made after the Phase 1 feedback, including a release on the App Store for iPhone users, the status of each activity in the work plan, and the next stages: security, cloud deployment, privacy and release on Google Play and the App Store.</w:t>
       </w:r>
     </w:p>
     <w:p>
@@ -1511,6 +1511,38 @@
           </w:p>
           <w:p>
             <w:pPr>
+              <w:spacing w:before="0" w:after="80" w:line="252" w:lineRule="auto"/>
+              <w:jc w:val="both"/>
+            </w:pPr>
+            <w:r>
+              <w:rPr>
+                <w:rFonts w:ascii="Calibri" w:hAnsi="Calibri" w:cs="Calibri" w:eastAsia="Calibri"/>
+                <w:color w:val="000000"/>
+                <w:sz w:val="20"/>
+                <w:szCs w:val="20"/>
+              </w:rPr>
+              <w:t xml:space="preserve">Desde el 26 de octubre estoy en el Sprint 1 (seguridad y confiabilidad), que termina el 6 de noviembre. Ya están listos CORS restringido y el límite de intentos en login y escaneo (error 429), con 10 pruebas automatizadas.</w:t>
+            </w:r>
+          </w:p>
+          <w:p>
+            <w:pPr>
+              <w:spacing w:before="0" w:after="80" w:line="252" w:lineRule="auto"/>
+              <w:jc w:val="both"/>
+            </w:pPr>
+            <w:r>
+              <w:rPr>
+                <w:rFonts w:ascii="Calibri" w:hAnsi="Calibri" w:cs="Calibri" w:eastAsia="Calibri"/>
+                <w:b/>
+                <w:bCs/>
+                <w:color w:val="000000"/>
+                <w:sz w:val="20"/>
+                <w:szCs w:val="20"/>
+              </w:rPr>
+              <w:t xml:space="preserve">Estado de los objetivos específicos:</w:t>
+            </w:r>
+          </w:p>
+          <w:p>
+            <w:pPr>
               <w:tabs>
                 <w:tab w:val="left" w:pos="240"/>
               </w:tabs>
@@ -1525,39 +1557,7 @@
                 <w:sz w:val="20"/>
                 <w:szCs w:val="20"/>
               </w:rPr>
-              <w:t xml:space="preserve">•	Ordené el repositorio con la estructura y los nombres de archivo que pide la asignatura.</w:t>
-            </w:r>
-          </w:p>
-          <w:p>
-            <w:pPr>
-              <w:spacing w:before="0" w:after="80" w:line="252" w:lineRule="auto"/>
-              <w:jc w:val="both"/>
-            </w:pPr>
-            <w:r>
-              <w:rPr>
-                <w:rFonts w:ascii="Calibri" w:hAnsi="Calibri" w:cs="Calibri" w:eastAsia="Calibri"/>
-                <w:color w:val="000000"/>
-                <w:sz w:val="20"/>
-                <w:szCs w:val="20"/>
-              </w:rPr>
-              <w:t xml:space="preserve">Desde el 26 de octubre estoy en el Sprint 1 (seguridad y confiabilidad), que termina el 6 de noviembre.</w:t>
-            </w:r>
-          </w:p>
-          <w:p>
-            <w:pPr>
-              <w:spacing w:before="0" w:after="80" w:line="252" w:lineRule="auto"/>
-              <w:jc w:val="both"/>
-            </w:pPr>
-            <w:r>
-              <w:rPr>
-                <w:rFonts w:ascii="Calibri" w:hAnsi="Calibri" w:cs="Calibri" w:eastAsia="Calibri"/>
-                <w:b/>
-                <w:bCs/>
-                <w:color w:val="000000"/>
-                <w:sz w:val="20"/>
-                <w:szCs w:val="20"/>
-              </w:rPr>
-              <w:t xml:space="preserve">Estado de los objetivos específicos:</w:t>
+              <w:t xml:space="preserve">•	OE1, analizar el proceso del local y definir requerimientos: cumplido. Los requisitos funcionales y no funcionales están documentados en el repositorio.</w:t>
             </w:r>
           </w:p>
           <w:p>
@@ -1576,7 +1576,7 @@
                 <w:sz w:val="20"/>
                 <w:szCs w:val="20"/>
               </w:rPr>
-              <w:t xml:space="preserve">•	OE1, analizar el proceso del local y definir requerimientos: cumplido. Los requisitos funcionales y no funcionales están documentados en el repositorio.</w:t>
+              <w:t xml:space="preserve">•	OE2, diseñar la arquitectura y el modelo de datos: cumplido para el alcance actual (cliente-servidor en tres capas y 12 colecciones con índices).</w:t>
             </w:r>
           </w:p>
           <w:p>
@@ -1595,7 +1595,7 @@
                 <w:sz w:val="20"/>
                 <w:szCs w:val="20"/>
               </w:rPr>
-              <w:t xml:space="preserve">•	OE2, diseñar la arquitectura y el modelo de datos: cumplido para el alcance actual (cliente-servidor en tres capas y 12 colecciones con índices).</w:t>
+              <w:t xml:space="preserve">•	OE3, construir lo pendiente en sprints con Scrum: en curso (Sprint 0 terminado, Sprint 1 en curso).</w:t>
             </w:r>
           </w:p>
           <w:p>
@@ -1614,7 +1614,7 @@
                 <w:sz w:val="20"/>
                 <w:szCs w:val="20"/>
               </w:rPr>
-              <w:t xml:space="preserve">•	OE3, construir lo pendiente en sprints con Scrum: en curso (Sprint 0 terminado, Sprint 1 en curso).</w:t>
+              <w:t xml:space="preserve">•	OE4, corregir vulnerabilidades y cumplir el RGPD: en curso. Ya están resueltos las credenciales, el endpoint expuesto, CORS y el límite de intentos; el resto corresponde a los Sprints 1 y 3.</w:t>
             </w:r>
           </w:p>
           <w:p>
@@ -1633,7 +1633,257 @@
                 <w:sz w:val="20"/>
                 <w:szCs w:val="20"/>
               </w:rPr>
-              <w:t xml:space="preserve">•	OE4, corregir vulnerabilidades y cumplir el RGPD: en curso. Las credenciales y el endpoint expuesto ya están resueltos; el resto corresponde a los Sprints 1 y 3.</w:t>
+              <w:t xml:space="preserve">•	OE5, certificar el sistema con pruebas: iniciado con 10 pruebas; la suite completa va en el Sprint 3.</w:t>
+            </w:r>
+          </w:p>
+          <w:p>
+            <w:pPr>
+              <w:tabs>
+                <w:tab w:val="left" w:pos="240"/>
+              </w:tabs>
+              <w:spacing w:before="0" w:after="0" w:line="252" w:lineRule="auto"/>
+              <w:ind w:left="240" w:hanging="240"/>
+              <w:jc w:val="left"/>
+            </w:pPr>
+            <w:r>
+              <w:rPr>
+                <w:rFonts w:ascii="Calibri" w:hAnsi="Calibri" w:cs="Calibri" w:eastAsia="Calibri"/>
+                <w:color w:val="000000"/>
+                <w:sz w:val="20"/>
+                <w:szCs w:val="20"/>
+              </w:rPr>
+              <w:t xml:space="preserve">•	OE6 (ajustado), desplegar en la nube y publicar en Google Play y App Store: no iniciado, planificado para el Sprint 2 y el cierre.</w:t>
+            </w:r>
+          </w:p>
+        </w:tc>
+      </w:tr>
+      <w:tr>
+        <w:trPr>
+          <w:trHeight w:val="1247"/>
+        </w:trPr>
+        <w:tc>
+          <w:tcPr>
+            <w:tcW w:w="2528" w:type="dxa"/>
+            <w:vAlign w:val="center"/>
+          </w:tcPr>
+          <w:p>
+            <w:pPr>
+              <w:rPr>
+                <w:rFonts w:ascii="Calibri" w:hAnsi="Calibri"/>
+                <w:color w:val="1F3864" w:themeColor="accent1" w:themeShade="80"/>
+              </w:rPr>
+            </w:pPr>
+            <w:r>
+              <w:rPr>
+                <w:rFonts w:ascii="Calibri" w:hAnsi="Calibri"/>
+                <w:color w:val="1F3864" w:themeColor="accent1" w:themeShade="80"/>
+              </w:rPr>
+              <w:t>Objetivos</w:t>
+            </w:r>
+          </w:p>
+        </w:tc>
+        <w:tc>
+          <w:tcPr>
+            <w:tcW w:w="7111" w:type="dxa"/>
+            <w:vAlign w:val="center"/>
+          </w:tcPr>
+          <w:p>
+            <w:pPr>
+              <w:spacing w:before="0" w:after="80" w:line="252" w:lineRule="auto"/>
+              <w:jc w:val="both"/>
+            </w:pPr>
+            <w:r>
+              <w:rPr>
+                <w:rFonts w:ascii="Calibri" w:hAnsi="Calibri" w:cs="Calibri" w:eastAsia="Calibri"/>
+                <w:color w:val="000000"/>
+                <w:sz w:val="20"/>
+                <w:szCs w:val="20"/>
+              </w:rPr>
+              <w:t xml:space="preserve">Se mantiene el objetivo general. Se ajusta el objetivo específico 6, que ahora es: </w:t>
+            </w:r>
+            <w:r>
+              <w:rPr>
+                <w:rFonts w:ascii="Calibri" w:hAnsi="Calibri" w:cs="Calibri" w:eastAsia="Calibri"/>
+                <w:b/>
+                <w:bCs/>
+                <w:color w:val="000000"/>
+                <w:sz w:val="20"/>
+                <w:szCs w:val="20"/>
+              </w:rPr>
+              <w:t xml:space="preserve">desplegar la API y la base de datos en la nube y publicar la aplicación en Google Play y en App Store, partiendo por una prueba cerrada y TestFlight.</w:t>
+            </w:r>
+          </w:p>
+          <w:p>
+            <w:pPr>
+              <w:spacing w:before="0" w:after="0" w:line="252" w:lineRule="auto"/>
+              <w:jc w:val="both"/>
+            </w:pPr>
+            <w:r>
+              <w:rPr>
+                <w:rFonts w:ascii="Calibri" w:hAnsi="Calibri" w:cs="Calibri" w:eastAsia="Calibri"/>
+                <w:color w:val="000000"/>
+                <w:sz w:val="20"/>
+                <w:szCs w:val="20"/>
+              </w:rPr>
+              <w:t xml:space="preserve">El ajuste responde a la retroalimentación de la Fase 1: en Irlanda el 47 % de los teléfonos usa iOS (StatCounter, 2026), así que publicar solo en Android dejaba fuera a casi la mitad de los clientes. Los otros cinco objetivos se mantienen.</w:t>
+            </w:r>
+          </w:p>
+        </w:tc>
+      </w:tr>
+      <w:tr>
+        <w:trPr>
+          <w:trHeight w:val="939"/>
+        </w:trPr>
+        <w:tc>
+          <w:tcPr>
+            <w:tcW w:w="2528" w:type="dxa"/>
+            <w:vAlign w:val="center"/>
+          </w:tcPr>
+          <w:p>
+            <w:pPr>
+              <w:rPr>
+                <w:rFonts w:ascii="Calibri" w:hAnsi="Calibri"/>
+                <w:color w:val="1F3864" w:themeColor="accent1" w:themeShade="80"/>
+              </w:rPr>
+            </w:pPr>
+            <w:r>
+              <w:rPr>
+                <w:rFonts w:ascii="Calibri" w:hAnsi="Calibri"/>
+                <w:color w:val="1F3864" w:themeColor="accent1" w:themeShade="80"/>
+              </w:rPr>
+              <w:t>Metodología</w:t>
+            </w:r>
+          </w:p>
+        </w:tc>
+        <w:tc>
+          <w:tcPr>
+            <w:tcW w:w="7111" w:type="dxa"/>
+            <w:vAlign w:val="center"/>
+          </w:tcPr>
+          <w:p>
+            <w:pPr>
+              <w:spacing w:before="0" w:after="80" w:line="252" w:lineRule="auto"/>
+              <w:jc w:val="both"/>
+            </w:pPr>
+            <w:r>
+              <w:rPr>
+                <w:rFonts w:ascii="Calibri" w:hAnsi="Calibri" w:cs="Calibri" w:eastAsia="Calibri"/>
+                <w:b/>
+                <w:bCs/>
+                <w:color w:val="000000"/>
+                <w:sz w:val="20"/>
+                <w:szCs w:val="20"/>
+              </w:rPr>
+              <w:t xml:space="preserve">1.2 Metodología aplicada</w:t>
+            </w:r>
+          </w:p>
+          <w:p>
+            <w:pPr>
+              <w:spacing w:before="0" w:after="80" w:line="252" w:lineRule="auto"/>
+              <w:jc w:val="both"/>
+            </w:pPr>
+            <w:r>
+              <w:rPr>
+                <w:rFonts w:ascii="Calibri" w:hAnsi="Calibri" w:cs="Calibri" w:eastAsia="Calibri"/>
+                <w:color w:val="000000"/>
+                <w:sz w:val="20"/>
+                <w:szCs w:val="20"/>
+              </w:rPr>
+              <w:t xml:space="preserve">Se mantiene Scrum con sprints de dos semanas (Schwaber y Sutherland, 2020). Lo que ajusté fue la forma de planificar, a partir de la retroalimentación de la Fase 1: en lugar de detallar fechas y tareas, cada sprint tiene una meta y una razón para ir en ese orden. Primero va lo que impide publicar: la seguridad. Después la nube, porque Google Play exige a las cuentas nuevas una prueba cerrada de 14 días con al menos 12 testers (Google, s.f.). Luego la privacidad y las pruebas, que son requisito antes de abrir la app al público.</w:t>
+            </w:r>
+          </w:p>
+          <w:p>
+            <w:pPr>
+              <w:spacing w:before="0" w:after="80" w:line="252" w:lineRule="auto"/>
+              <w:jc w:val="both"/>
+            </w:pPr>
+            <w:r>
+              <w:rPr>
+                <w:rFonts w:ascii="Calibri" w:hAnsi="Calibri" w:cs="Calibri" w:eastAsia="Calibri"/>
+                <w:color w:val="000000"/>
+                <w:sz w:val="20"/>
+                <w:szCs w:val="20"/>
+              </w:rPr>
+              <w:t xml:space="preserve">En la práctica, el backlog está en GitHub: cada sprint es un milestone y cada tarea un issue, con historias de usuario y estimación en puntos (13 por sprint). El avance se controla cerrando issues y cada cambio queda registrado en el historial de commits. Cada sprint termina con una revisión, con demo en un teléfono, y una retrospectiva. Como el proyecto es individual, asumo los roles de Product Owner, Scrum Master y desarrollador.</w:t>
+            </w:r>
+          </w:p>
+          <w:p>
+            <w:pPr>
+              <w:spacing w:before="0" w:after="0" w:line="252" w:lineRule="auto"/>
+              <w:jc w:val="both"/>
+            </w:pPr>
+            <w:r>
+              <w:rPr>
+                <w:rFonts w:ascii="Calibri" w:hAnsi="Calibri" w:cs="Calibri" w:eastAsia="Calibri"/>
+                <w:color w:val="000000"/>
+                <w:sz w:val="20"/>
+                <w:szCs w:val="20"/>
+              </w:rPr>
+              <w:t xml:space="preserve">Ejemplo: el pedido de publicar también en iOS entró al backlog como tareas nuevas y se rebalanceó el Sprint 2, sin rehacer el plan.</w:t>
+            </w:r>
+          </w:p>
+        </w:tc>
+      </w:tr>
+      <w:tr>
+        <w:trPr>
+          <w:trHeight w:val="2377"/>
+        </w:trPr>
+        <w:tc>
+          <w:tcPr>
+            <w:tcW w:w="2528" w:type="dxa"/>
+            <w:vAlign w:val="center"/>
+          </w:tcPr>
+          <w:p>
+            <w:pPr>
+              <w:rPr>
+                <w:rFonts w:ascii="Calibri" w:hAnsi="Calibri"/>
+                <w:color w:val="1F3864" w:themeColor="accent1" w:themeShade="80"/>
+              </w:rPr>
+            </w:pPr>
+            <w:r>
+              <w:rPr>
+                <w:rFonts w:ascii="Calibri" w:hAnsi="Calibri"/>
+                <w:color w:val="1F3864" w:themeColor="accent1" w:themeShade="80"/>
+              </w:rPr>
+              <w:t>Evidencias de avance</w:t>
+            </w:r>
+          </w:p>
+        </w:tc>
+        <w:tc>
+          <w:tcPr>
+            <w:tcW w:w="7111" w:type="dxa"/>
+            <w:vAlign w:val="center"/>
+          </w:tcPr>
+          <w:p>
+            <w:pPr>
+              <w:spacing w:before="0" w:after="80" w:line="252" w:lineRule="auto"/>
+              <w:jc w:val="both"/>
+            </w:pPr>
+            <w:r>
+              <w:rPr>
+                <w:rFonts w:ascii="Calibri" w:hAnsi="Calibri" w:cs="Calibri" w:eastAsia="Calibri"/>
+                <w:b/>
+                <w:bCs/>
+                <w:color w:val="000000"/>
+                <w:sz w:val="20"/>
+                <w:szCs w:val="20"/>
+              </w:rPr>
+              <w:t xml:space="preserve">1.3 Evidencias de avance y calidad</w:t>
+            </w:r>
+          </w:p>
+          <w:p>
+            <w:pPr>
+              <w:spacing w:before="0" w:after="80" w:line="252" w:lineRule="auto"/>
+              <w:jc w:val="both"/>
+            </w:pPr>
+            <w:r>
+              <w:rPr>
+                <w:rFonts w:ascii="Calibri" w:hAnsi="Calibri" w:cs="Calibri" w:eastAsia="Calibri"/>
+                <w:color w:val="000000"/>
+                <w:sz w:val="20"/>
+                <w:szCs w:val="20"/>
+              </w:rPr>
+              <w:t xml:space="preserve">Las evidencias están en el repositorio público https://github.com/44ndy/clancys-rewards, organizadas según la estructura de la asignatura:</w:t>
             </w:r>
           </w:p>
           <w:p>
@@ -1652,257 +1902,7 @@
                 <w:sz w:val="20"/>
                 <w:szCs w:val="20"/>
               </w:rPr>
-              <w:t xml:space="preserve">•	OE5, certificar el sistema con pruebas: no iniciado, planificado para el Sprint 3.</w:t>
-            </w:r>
-          </w:p>
-          <w:p>
-            <w:pPr>
-              <w:tabs>
-                <w:tab w:val="left" w:pos="240"/>
-              </w:tabs>
-              <w:spacing w:before="0" w:after="0" w:line="252" w:lineRule="auto"/>
-              <w:ind w:left="240" w:hanging="240"/>
-              <w:jc w:val="left"/>
-            </w:pPr>
-            <w:r>
-              <w:rPr>
-                <w:rFonts w:ascii="Calibri" w:hAnsi="Calibri" w:cs="Calibri" w:eastAsia="Calibri"/>
-                <w:color w:val="000000"/>
-                <w:sz w:val="20"/>
-                <w:szCs w:val="20"/>
-              </w:rPr>
-              <w:t xml:space="preserve">•	OE6 (ajustado), desplegar en la nube y publicar en Google Play y App Store: no iniciado, planificado para el Sprint 2 y el cierre.</w:t>
-            </w:r>
-          </w:p>
-        </w:tc>
-      </w:tr>
-      <w:tr>
-        <w:trPr>
-          <w:trHeight w:val="1247"/>
-        </w:trPr>
-        <w:tc>
-          <w:tcPr>
-            <w:tcW w:w="2528" w:type="dxa"/>
-            <w:vAlign w:val="center"/>
-          </w:tcPr>
-          <w:p>
-            <w:pPr>
-              <w:rPr>
-                <w:rFonts w:ascii="Calibri" w:hAnsi="Calibri"/>
-                <w:color w:val="1F3864" w:themeColor="accent1" w:themeShade="80"/>
-              </w:rPr>
-            </w:pPr>
-            <w:r>
-              <w:rPr>
-                <w:rFonts w:ascii="Calibri" w:hAnsi="Calibri"/>
-                <w:color w:val="1F3864" w:themeColor="accent1" w:themeShade="80"/>
-              </w:rPr>
-              <w:t>Objetivos</w:t>
-            </w:r>
-          </w:p>
-        </w:tc>
-        <w:tc>
-          <w:tcPr>
-            <w:tcW w:w="7111" w:type="dxa"/>
-            <w:vAlign w:val="center"/>
-          </w:tcPr>
-          <w:p>
-            <w:pPr>
-              <w:spacing w:before="0" w:after="80" w:line="252" w:lineRule="auto"/>
-              <w:jc w:val="both"/>
-            </w:pPr>
-            <w:r>
-              <w:rPr>
-                <w:rFonts w:ascii="Calibri" w:hAnsi="Calibri" w:cs="Calibri" w:eastAsia="Calibri"/>
-                <w:color w:val="000000"/>
-                <w:sz w:val="20"/>
-                <w:szCs w:val="20"/>
-              </w:rPr>
-              <w:t xml:space="preserve">Se mantiene el objetivo general. Se ajusta el objetivo específico 6, que ahora es: </w:t>
-            </w:r>
-            <w:r>
-              <w:rPr>
-                <w:rFonts w:ascii="Calibri" w:hAnsi="Calibri" w:cs="Calibri" w:eastAsia="Calibri"/>
-                <w:b/>
-                <w:bCs/>
-                <w:color w:val="000000"/>
-                <w:sz w:val="20"/>
-                <w:szCs w:val="20"/>
-              </w:rPr>
-              <w:t xml:space="preserve">desplegar la API y la base de datos en la nube y publicar la aplicación en Google Play y en App Store, partiendo por una prueba cerrada y TestFlight.</w:t>
-            </w:r>
-          </w:p>
-          <w:p>
-            <w:pPr>
-              <w:spacing w:before="0" w:after="0" w:line="252" w:lineRule="auto"/>
-              <w:jc w:val="both"/>
-            </w:pPr>
-            <w:r>
-              <w:rPr>
-                <w:rFonts w:ascii="Calibri" w:hAnsi="Calibri" w:cs="Calibri" w:eastAsia="Calibri"/>
-                <w:color w:val="000000"/>
-                <w:sz w:val="20"/>
-                <w:szCs w:val="20"/>
-              </w:rPr>
-              <w:t xml:space="preserve">El ajuste responde a la retroalimentación de la Fase 1: en Irlanda el 47 % de los teléfonos usa iOS (StatCounter, 2026), así que publicar solo en Android dejaba fuera a casi la mitad de los clientes. Los otros cinco objetivos se mantienen.</w:t>
-            </w:r>
-          </w:p>
-        </w:tc>
-      </w:tr>
-      <w:tr>
-        <w:trPr>
-          <w:trHeight w:val="939"/>
-        </w:trPr>
-        <w:tc>
-          <w:tcPr>
-            <w:tcW w:w="2528" w:type="dxa"/>
-            <w:vAlign w:val="center"/>
-          </w:tcPr>
-          <w:p>
-            <w:pPr>
-              <w:rPr>
-                <w:rFonts w:ascii="Calibri" w:hAnsi="Calibri"/>
-                <w:color w:val="1F3864" w:themeColor="accent1" w:themeShade="80"/>
-              </w:rPr>
-            </w:pPr>
-            <w:r>
-              <w:rPr>
-                <w:rFonts w:ascii="Calibri" w:hAnsi="Calibri"/>
-                <w:color w:val="1F3864" w:themeColor="accent1" w:themeShade="80"/>
-              </w:rPr>
-              <w:t>Metodología</w:t>
-            </w:r>
-          </w:p>
-        </w:tc>
-        <w:tc>
-          <w:tcPr>
-            <w:tcW w:w="7111" w:type="dxa"/>
-            <w:vAlign w:val="center"/>
-          </w:tcPr>
-          <w:p>
-            <w:pPr>
-              <w:spacing w:before="0" w:after="80" w:line="252" w:lineRule="auto"/>
-              <w:jc w:val="both"/>
-            </w:pPr>
-            <w:r>
-              <w:rPr>
-                <w:rFonts w:ascii="Calibri" w:hAnsi="Calibri" w:cs="Calibri" w:eastAsia="Calibri"/>
-                <w:b/>
-                <w:bCs/>
-                <w:color w:val="000000"/>
-                <w:sz w:val="20"/>
-                <w:szCs w:val="20"/>
-              </w:rPr>
-              <w:t xml:space="preserve">1.2 Metodología aplicada</w:t>
-            </w:r>
-          </w:p>
-          <w:p>
-            <w:pPr>
-              <w:spacing w:before="0" w:after="80" w:line="252" w:lineRule="auto"/>
-              <w:jc w:val="both"/>
-            </w:pPr>
-            <w:r>
-              <w:rPr>
-                <w:rFonts w:ascii="Calibri" w:hAnsi="Calibri" w:cs="Calibri" w:eastAsia="Calibri"/>
-                <w:color w:val="000000"/>
-                <w:sz w:val="20"/>
-                <w:szCs w:val="20"/>
-              </w:rPr>
-              <w:t xml:space="preserve">Se mantiene Scrum con sprints de dos semanas (Schwaber y Sutherland, 2020). Lo que ajusté fue la forma de planificar, a partir de la retroalimentación de la Fase 1: en lugar de detallar fechas y tareas, cada sprint tiene una meta y una razón para ir en ese orden. Primero va lo que impide publicar: la seguridad. Después la nube, porque Google Play exige a las cuentas nuevas una prueba cerrada de 14 días con al menos 12 testers (Google, s.f.). Luego la privacidad y las pruebas, que son requisito antes de abrir la app al público.</w:t>
-            </w:r>
-          </w:p>
-          <w:p>
-            <w:pPr>
-              <w:spacing w:before="0" w:after="80" w:line="252" w:lineRule="auto"/>
-              <w:jc w:val="both"/>
-            </w:pPr>
-            <w:r>
-              <w:rPr>
-                <w:rFonts w:ascii="Calibri" w:hAnsi="Calibri" w:cs="Calibri" w:eastAsia="Calibri"/>
-                <w:color w:val="000000"/>
-                <w:sz w:val="20"/>
-                <w:szCs w:val="20"/>
-              </w:rPr>
-              <w:t xml:space="preserve">En la práctica, el backlog está en GitHub: cada sprint es un milestone y cada tarea un issue, con historias de usuario y estimación en puntos (13 por sprint). El avance se controla cerrando issues y cada cambio queda registrado en el historial de commits. Cada sprint termina con una revisión, con demo en un teléfono, y una retrospectiva. Como el proyecto es individual, asumo los roles de Product Owner, Scrum Master y desarrollador.</w:t>
-            </w:r>
-          </w:p>
-          <w:p>
-            <w:pPr>
-              <w:spacing w:before="0" w:after="0" w:line="252" w:lineRule="auto"/>
-              <w:jc w:val="both"/>
-            </w:pPr>
-            <w:r>
-              <w:rPr>
-                <w:rFonts w:ascii="Calibri" w:hAnsi="Calibri" w:cs="Calibri" w:eastAsia="Calibri"/>
-                <w:color w:val="000000"/>
-                <w:sz w:val="20"/>
-                <w:szCs w:val="20"/>
-              </w:rPr>
-              <w:t xml:space="preserve">Ejemplo: el pedido de publicar también en iOS entró al backlog como tareas nuevas y se rebalanceó el Sprint 2, sin rehacer el plan.</w:t>
-            </w:r>
-          </w:p>
-        </w:tc>
-      </w:tr>
-      <w:tr>
-        <w:trPr>
-          <w:trHeight w:val="2377"/>
-        </w:trPr>
-        <w:tc>
-          <w:tcPr>
-            <w:tcW w:w="2528" w:type="dxa"/>
-            <w:vAlign w:val="center"/>
-          </w:tcPr>
-          <w:p>
-            <w:pPr>
-              <w:rPr>
-                <w:rFonts w:ascii="Calibri" w:hAnsi="Calibri"/>
-                <w:color w:val="1F3864" w:themeColor="accent1" w:themeShade="80"/>
-              </w:rPr>
-            </w:pPr>
-            <w:r>
-              <w:rPr>
-                <w:rFonts w:ascii="Calibri" w:hAnsi="Calibri"/>
-                <w:color w:val="1F3864" w:themeColor="accent1" w:themeShade="80"/>
-              </w:rPr>
-              <w:t>Evidencias de avance</w:t>
-            </w:r>
-          </w:p>
-        </w:tc>
-        <w:tc>
-          <w:tcPr>
-            <w:tcW w:w="7111" w:type="dxa"/>
-            <w:vAlign w:val="center"/>
-          </w:tcPr>
-          <w:p>
-            <w:pPr>
-              <w:spacing w:before="0" w:after="80" w:line="252" w:lineRule="auto"/>
-              <w:jc w:val="both"/>
-            </w:pPr>
-            <w:r>
-              <w:rPr>
-                <w:rFonts w:ascii="Calibri" w:hAnsi="Calibri" w:cs="Calibri" w:eastAsia="Calibri"/>
-                <w:b/>
-                <w:bCs/>
-                <w:color w:val="000000"/>
-                <w:sz w:val="20"/>
-                <w:szCs w:val="20"/>
-              </w:rPr>
-              <w:t xml:space="preserve">1.3 Evidencias de avance y calidad</w:t>
-            </w:r>
-          </w:p>
-          <w:p>
-            <w:pPr>
-              <w:spacing w:before="0" w:after="80" w:line="252" w:lineRule="auto"/>
-              <w:jc w:val="both"/>
-            </w:pPr>
-            <w:r>
-              <w:rPr>
-                <w:rFonts w:ascii="Calibri" w:hAnsi="Calibri" w:cs="Calibri" w:eastAsia="Calibri"/>
-                <w:color w:val="000000"/>
-                <w:sz w:val="20"/>
-                <w:szCs w:val="20"/>
-              </w:rPr>
-              <w:t xml:space="preserve">Las evidencias están en el repositorio público https://github.com/44ndy/clancys-rewards, organizadas según la estructura de la asignatura:</w:t>
+              <w:t xml:space="preserve">•	Programación: código del frontend (React Native, Expo y TypeScript), del backend (FastAPI) y sus pruebas (pytest, en backend/tests). Muestra el sistema construido y su avance commit a commit.</w:t>
             </w:r>
           </w:p>
           <w:p>
@@ -1921,7 +1921,7 @@
                 <w:sz w:val="20"/>
                 <w:szCs w:val="20"/>
               </w:rPr>
-              <w:t xml:space="preserve">•	Programación: código del frontend (React Native, Expo y TypeScript) y del backend (FastAPI). Muestra el sistema construido y su avance commit a commit.</w:t>
+              <w:t xml:space="preserve">•	Almacenamiento de datos: modelo de datos en Fase 2/Evidencias de sistema/Base de datos, con las 12 colecciones, sus campos e índices. Muestra cómo se guardan visitas, canjes y QR.</w:t>
             </w:r>
           </w:p>
           <w:p>
@@ -1940,7 +1940,7 @@
                 <w:sz w:val="20"/>
                 <w:szCs w:val="20"/>
               </w:rPr>
-              <w:t xml:space="preserve">•	Almacenamiento de datos: modelo de datos en Fase 2/Evidencias de sistema/Base de datos, con las 12 colecciones, sus campos e índices. Muestra cómo se guardan visitas, canjes y QR.</w:t>
+              <w:t xml:space="preserve">•	Documentación: matriz de requisitos en Excel (28 requisitos con criterios de aceptación), arquitectura, backlog por sprint y plan de publicación en iOS en Fase 2/Evidencias de documentación. Muestran el análisis y el diseño.</w:t>
             </w:r>
           </w:p>
           <w:p>
@@ -1959,7 +1959,7 @@
                 <w:sz w:val="20"/>
                 <w:szCs w:val="20"/>
               </w:rPr>
-              <w:t xml:space="preserve">•	Documentación: matriz de requisitos en Excel (28 requisitos con criterios de aceptación), arquitectura, backlog por sprint y plan de publicación en iOS en Fase 2/Evidencias de documentación. Muestran el análisis y el diseño.</w:t>
+              <w:t xml:space="preserve">•	Sistema funcionando: capturas del flujo completo en Fase 2/Evidencias de sistema/Aplicación, y la demo en vivo de la presentación de avance.</w:t>
             </w:r>
           </w:p>
           <w:p>
@@ -1978,26 +1978,7 @@
                 <w:sz w:val="20"/>
                 <w:szCs w:val="20"/>
               </w:rPr>
-              <w:t xml:space="preserve">•	Sistema funcionando: capturas del flujo completo en Fase 2/Evidencias de sistema/Aplicación, y la demo en vivo de la presentación de avance.</w:t>
-            </w:r>
-          </w:p>
-          <w:p>
-            <w:pPr>
-              <w:tabs>
-                <w:tab w:val="left" w:pos="240"/>
-              </w:tabs>
-              <w:spacing w:before="0" w:after="40" w:line="252" w:lineRule="auto"/>
-              <w:ind w:left="240" w:hanging="240"/>
-              <w:jc w:val="left"/>
-            </w:pPr>
-            <w:r>
-              <w:rPr>
-                <w:rFonts w:ascii="Calibri" w:hAnsi="Calibri" w:cs="Calibri" w:eastAsia="Calibri"/>
-                <w:color w:val="000000"/>
-                <w:sz w:val="20"/>
-                <w:szCs w:val="20"/>
-              </w:rPr>
-              <w:t xml:space="preserve">•	Gestión: milestones e issues del backlog en GitHub, que muestran la aplicación de Scrum.</w:t>
+              <w:t xml:space="preserve">•	Gestión: milestones e issues en GitHub, que muestran la aplicación de Scrum.</w:t>
             </w:r>
           </w:p>
           <w:p>
@@ -2012,7 +1993,7 @@
                 <w:sz w:val="20"/>
                 <w:szCs w:val="20"/>
               </w:rPr>
-              <w:t xml:space="preserve">Para resguardar la calidad apliqué prácticas de la disciplina: variables de entorno y ningún secreto en el repositorio (Wiggins, 2017); contraseñas con bcrypt y sesiones con JWT; permisos por rol en el servidor; validación de datos con modelos tipados; QR con vencimiento automático; y OWASP Mobile Top 10 como referencia (OWASP Foundation, 2024).</w:t>
+              <w:t xml:space="preserve">Prácticas de calidad aplicadas: variables de entorno y ningún secreto en el repositorio (Wiggins, 2017); contraseñas con bcrypt y sesiones con JWT; permisos por rol en el servidor; validación de datos con modelos tipados; QR con vencimiento automático; y OWASP Mobile Top 10 como referencia (OWASP Foundation, 2024).</w:t>
             </w:r>
           </w:p>
         </w:tc>
@@ -2918,7 +2899,7 @@
                 <w:sz w:val="15"/>
                 <w:szCs w:val="15"/>
               </w:rPr>
-              <w:t xml:space="preserve">En curso, según lo planificado.</w:t>
+              <w:t xml:space="preserve">En curso, según lo planificado. Listos: CORS y límite de intentos.</w:t>
             </w:r>
           </w:p>
         </w:tc>
@@ -3417,7 +3398,7 @@
         <w:tc>
           <w:tcPr>
             <w:tcW w:w="1300" w:type="dxa"/>
-            <w:shd w:val="clear" w:color="auto" w:fill="FFFFFF"/>
+            <w:shd w:val="clear" w:color="auto" w:fill="FFF2CC"/>
           </w:tcPr>
           <w:p>
             <w:pPr>
@@ -3431,7 +3412,7 @@
                 <w:sz w:val="15"/>
                 <w:szCs w:val="15"/>
               </w:rPr>
-              <w:t xml:space="preserve">No iniciado (según plan).</w:t>
+              <w:t xml:space="preserve">En curso: 10 pruebas del límite de intentos.</w:t>
             </w:r>
           </w:p>
         </w:tc>
@@ -3452,7 +3433,7 @@
                 <w:sz w:val="15"/>
                 <w:szCs w:val="15"/>
               </w:rPr>
-              <w:t xml:space="preserve">Sin ajustes.</w:t>
+              <w:t xml:space="preserve">Se adelantan al Sprint 1, junto con cada tarea.</w:t>
             </w:r>
           </w:p>
         </w:tc>
@@ -3813,7 +3794,7 @@
           <w:sz w:val="18"/>
           <w:szCs w:val="18"/>
         </w:rPr>
-        <w:t xml:space="preserve">Estados según la guía: Completado (verde), En curso (amarillo), Con retraso (rojo) y No iniciado (blanco). Fecha de corte: 28 de octubre de 2026.</w:t>
+        <w:t xml:space="preserve">Estados según la guía: Completado (verde), En curso (amarillo), Con retraso (rojo) y No iniciado (blanco). Fecha de corte: 29 de octubre de 2026.</w:t>
       </w:r>
     </w:p>
     <w:p>
@@ -4531,6 +4512,45 @@
                 <w:sz w:val="20"/>
                 <w:szCs w:val="20"/>
               </w:rPr>
+              <w:t xml:space="preserve">Pruebas desde el Sprint 1.</w:t>
+            </w:r>
+            <w:r>
+              <w:rPr>
+                <w:rFonts w:ascii="Calibri" w:hAnsi="Calibri" w:cs="Calibri" w:eastAsia="Calibri"/>
+                <w:color w:val="000000"/>
+                <w:sz w:val="20"/>
+                <w:szCs w:val="20"/>
+              </w:rPr>
+              <w:t xml:space="preserve"> Estaban planificadas para el Sprint 3, pero empecé a escribirlas junto con el límite de intentos, para que cada tarea de seguridad quede con su prueba.</w:t>
+            </w:r>
+          </w:p>
+          <w:p>
+            <w:pPr>
+              <w:tabs>
+                <w:tab w:val="left" w:pos="300"/>
+              </w:tabs>
+              <w:spacing w:before="0" w:after="60" w:line="252" w:lineRule="auto"/>
+              <w:ind w:left="300" w:hanging="300"/>
+              <w:jc w:val="left"/>
+            </w:pPr>
+            <w:r>
+              <w:rPr>
+                <w:rFonts w:ascii="Calibri" w:hAnsi="Calibri" w:cs="Calibri" w:eastAsia="Calibri"/>
+                <w:color w:val="000000"/>
+                <w:sz w:val="20"/>
+                <w:szCs w:val="20"/>
+              </w:rPr>
+              <w:t xml:space="preserve">•	</w:t>
+            </w:r>
+            <w:r>
+              <w:rPr>
+                <w:rFonts w:ascii="Calibri" w:hAnsi="Calibri" w:cs="Calibri" w:eastAsia="Calibri"/>
+                <w:b/>
+                <w:bCs/>
+                <w:color w:val="000000"/>
+                <w:sz w:val="20"/>
+                <w:szCs w:val="20"/>
+              </w:rPr>
               <w:t xml:space="preserve">Estructura del repositorio.</w:t>
             </w:r>
             <w:r>
@@ -4723,7 +4743,7 @@
                 <w:sz w:val="20"/>
                 <w:szCs w:val="20"/>
               </w:rPr>
-              <w:t xml:space="preserve">Sprint 2, Sprint 3, pruebas y cierre: no iniciados.</w:t>
+              <w:t xml:space="preserve">Sprint 2, Sprint 3 y cierre: no iniciados.</w:t>
             </w:r>
             <w:r>
               <w:rPr>
@@ -4776,7 +4796,7 @@
           <w:sz w:val="22"/>
           <w:szCs w:val="22"/>
         </w:rPr>
-        <w:t xml:space="preserve">So far, the project is on schedule. The prototype already covers the main flow, and Sprint 0 gave the project a solid base: version control, a public repository, a backlog in GitHub and no secrets in the code.</w:t>
+        <w:t xml:space="preserve">So far, the project is on schedule. The prototype covers the main flow, Sprint 0 gave the project a solid base, and in Sprint 1 the CORS rules and the limit on login and scan attempts are done, with their first tests.</w:t>
       </w:r>
     </w:p>
     <w:p>

</xml_diff>

<commit_message>
Actualizar capturas de la app con la versión actual
Capturas nuevas del flujo completo (cliente, personal y administración)
tomadas el 29 de octubre. Se reemplazan en la presentación y en el anexo
del informe de avance; en ambos se usa la visita sumada en lugar de la
pantalla del escáner de la versión web.
</commit_message>
<xml_diff>
--- a/Fase 2/Evidencias Grupales/2.4_GuiaEstudiante_Fase 2_DesarrolloProyecto APT (Español).docx
+++ b/Fase 2/Evidencias Grupales/2.4_GuiaEstudiante_Fase 2_DesarrolloProyecto APT (Español).docx
@@ -5181,7 +5181,7 @@
                     <a:graphicData uri="http://schemas.openxmlformats.org/drawingml/2006/picture">
                       <pic:pic>
                         <pic:nvPicPr>
-                          <pic:cNvPr id="0" name="04_Escaner_del_mesero.jpg"/>
+                          <pic:cNvPr id="0" name="05_Resultado_de_visita.jpg"/>
                           <pic:cNvPicPr/>
                         </pic:nvPicPr>
                         <pic:blipFill>
@@ -5216,7 +5216,7 @@
             <w:r>
               <w:drawing>
                 <wp:inline xmlns:a="http://schemas.openxmlformats.org/drawingml/2006/main" xmlns:pic="http://schemas.openxmlformats.org/drawingml/2006/picture">
-                  <wp:extent cx="1147779" cy="2484000"/>
+                  <wp:extent cx="1147167" cy="2484000"/>
                   <wp:docPr id="52" name="Picture 52"/>
                   <wp:cNvGraphicFramePr>
                     <a:graphicFrameLocks noChangeAspect="1"/>
@@ -5225,7 +5225,7 @@
                     <a:graphicData uri="http://schemas.openxmlformats.org/drawingml/2006/picture">
                       <pic:pic>
                         <pic:nvPicPr>
-                          <pic:cNvPr id="0" name="05_Resultado_de_visita.jpg"/>
+                          <pic:cNvPr id="0" name="08_Canje_-_entregar_al_cliente.jpg"/>
                           <pic:cNvPicPr/>
                         </pic:nvPicPr>
                         <pic:blipFill>
@@ -5237,7 +5237,7 @@
                         <pic:spPr>
                           <a:xfrm>
                             <a:off x="0" y="0"/>
-                            <a:ext cx="1147779" cy="2484000"/>
+                            <a:ext cx="1147167" cy="2484000"/>
                           </a:xfrm>
                           <a:prstGeom prst="rect"/>
                         </pic:spPr>
@@ -5333,7 +5333,7 @@
                 <w:sz w:val="16"/>
                 <w:szCs w:val="16"/>
               </w:rPr>
-              <w:t xml:space="preserve">Figura 2. Escáner del personal.</w:t>
+              <w:t xml:space="preserve">Figura 2. Visita sumada por el personal.</w:t>
             </w:r>
           </w:p>
         </w:tc>
@@ -5354,7 +5354,7 @@
                 <w:sz w:val="16"/>
                 <w:szCs w:val="16"/>
               </w:rPr>
-              <w:t xml:space="preserve">Figura 3. Visita sumada.</w:t>
+              <w:t xml:space="preserve">Figura 3. Entrega de un premio canjeado.</w:t>
             </w:r>
           </w:p>
         </w:tc>

</xml_diff>